<commit_message>
Correciones. Agregado OIA DesinfectandoArchivos.
</commit_message>
<xml_diff>
--- a/Códigos teoría/Guia de Java/Resolucion.docx
+++ b/Códigos teoría/Guia de Java/Resolucion.docx
@@ -3611,7 +3611,7 @@
           <w:rFonts w:ascii="Consolas" w:hAnsi="Consolas" w:cs="Consolas"/>
           <w:sz w:val="20"/>
           <w:szCs w:val="20"/>
-          <w:lang w:val="en-US"/>
+          <w:lang w:val="es-ES"/>
         </w:rPr>
       </w:pPr>
       <w:r>
@@ -3623,6 +3623,15 @@
           <w:lang w:val="en-US"/>
         </w:rPr>
         <w:tab/>
+      </w:r>
+      <w:r>
+        <w:rPr>
+          <w:rFonts w:ascii="Consolas" w:hAnsi="Consolas" w:cs="Consolas"/>
+          <w:color w:val="000000"/>
+          <w:sz w:val="20"/>
+          <w:szCs w:val="20"/>
+          <w:lang w:val="es-ES"/>
+        </w:rPr>
         <w:t>}</w:t>
       </w:r>
     </w:p>
@@ -4927,7 +4936,6 @@
         </w:rPr>
         <w:br/>
       </w:r>
-      <w:bookmarkStart w:id="0" w:name="_GoBack"/>
       <w:r>
         <w:rPr>
           <w:color w:val="FF0000"/>
@@ -4935,7 +4943,6 @@
         </w:rPr>
         <w:t>¿Esto?  No entendí.</w:t>
       </w:r>
-      <w:bookmarkEnd w:id="0"/>
       <w:r>
         <w:rPr>
           <w:szCs w:val="28"/>
@@ -6178,41 +6185,29 @@
         </w:rPr>
         <w:br/>
       </w:r>
-      <w:proofErr w:type="spellStart"/>
       <w:r>
         <w:rPr>
           <w:b/>
           <w:i/>
-          <w:lang w:val="es-ES"/>
-        </w:rPr>
-        <w:t>The</w:t>
-      </w:r>
-      <w:proofErr w:type="spellEnd"/>
-      <w:r>
-        <w:rPr>
-          <w:b/>
-          <w:i/>
-          <w:lang w:val="es-ES"/>
-        </w:rPr>
-        <w:t xml:space="preserve"> </w:t>
-      </w:r>
-      <w:proofErr w:type="spellStart"/>
+          <w:lang w:val="en-US"/>
+        </w:rPr>
+        <w:t xml:space="preserve">The </w:t>
+      </w:r>
       <w:r>
         <w:rPr>
           <w:rStyle w:val="CdigoHTML"/>
           <w:rFonts w:eastAsiaTheme="minorHAnsi"/>
           <w:b/>
           <w:i/>
-          <w:lang w:val="es-ES"/>
+          <w:lang w:val="en-US"/>
         </w:rPr>
         <w:t>finally</w:t>
       </w:r>
-      <w:proofErr w:type="spellEnd"/>
       <w:r>
         <w:rPr>
           <w:b/>
           <w:i/>
-          <w:lang w:val="es-ES"/>
+          <w:lang w:val="en-US"/>
         </w:rPr>
         <w:t xml:space="preserve"> </w:t>
       </w:r>
@@ -8983,18 +8978,133 @@
           <w:lang w:val="es-ES"/>
         </w:rPr>
       </w:pPr>
-      <w:r>
-        <w:rPr>
-          <w:lang w:val="es-ES"/>
-        </w:rPr>
+    </w:p>
+    <w:p>
+      <w:pPr>
+        <w:spacing w:after="0" w:line="276" w:lineRule="auto"/>
+        <w:rPr>
+          <w:lang w:val="es-ES"/>
+        </w:rPr>
+      </w:pPr>
+    </w:p>
+    <w:p>
+      <w:pPr>
+        <w:spacing w:after="0" w:line="276" w:lineRule="auto"/>
+        <w:rPr>
+          <w:lang w:val="es-ES"/>
+        </w:rPr>
+      </w:pPr>
+    </w:p>
+    <w:p>
+      <w:pPr>
+        <w:spacing w:after="0" w:line="276" w:lineRule="auto"/>
+        <w:rPr>
+          <w:lang w:val="es-ES"/>
+        </w:rPr>
+      </w:pPr>
+    </w:p>
+    <w:p>
+      <w:pPr>
+        <w:spacing w:after="0" w:line="276" w:lineRule="auto"/>
+        <w:rPr>
+          <w:lang w:val="es-ES"/>
+        </w:rPr>
+      </w:pPr>
+    </w:p>
+    <w:p>
+      <w:pPr>
+        <w:spacing w:after="0" w:line="276" w:lineRule="auto"/>
+        <w:rPr>
+          <w:lang w:val="es-ES"/>
+        </w:rPr>
+      </w:pPr>
+    </w:p>
+    <w:p>
+      <w:pPr>
+        <w:spacing w:after="0" w:line="276" w:lineRule="auto"/>
+        <w:rPr>
+          <w:lang w:val="es-ES"/>
+        </w:rPr>
+      </w:pPr>
+    </w:p>
+    <w:p>
+      <w:pPr>
+        <w:spacing w:after="0" w:line="276" w:lineRule="auto"/>
+        <w:rPr>
+          <w:lang w:val="es-ES"/>
+        </w:rPr>
+      </w:pPr>
+    </w:p>
+    <w:p>
+      <w:pPr>
+        <w:spacing w:after="0" w:line="276" w:lineRule="auto"/>
+        <w:rPr>
+          <w:lang w:val="es-ES"/>
+        </w:rPr>
+      </w:pPr>
+    </w:p>
+    <w:p>
+      <w:pPr>
+        <w:spacing w:after="0" w:line="276" w:lineRule="auto"/>
+        <w:rPr>
+          <w:lang w:val="es-ES"/>
+        </w:rPr>
+      </w:pPr>
+    </w:p>
+    <w:p>
+      <w:pPr>
+        <w:spacing w:after="0" w:line="276" w:lineRule="auto"/>
+        <w:rPr>
+          <w:lang w:val="es-ES"/>
+        </w:rPr>
+      </w:pPr>
+    </w:p>
+    <w:p>
+      <w:pPr>
+        <w:spacing w:after="0" w:line="276" w:lineRule="auto"/>
+        <w:rPr>
+          <w:lang w:val="es-ES"/>
+        </w:rPr>
+      </w:pPr>
+    </w:p>
+    <w:p>
+      <w:pPr>
+        <w:spacing w:after="0" w:line="276" w:lineRule="auto"/>
+        <w:rPr>
+          <w:lang w:val="es-ES"/>
+        </w:rPr>
+      </w:pPr>
+      <w:r>
+        <w:rPr>
+          <w:lang w:val="es-ES"/>
+        </w:rPr>
+        <w:br/>
+      </w:r>
+      <w:bookmarkStart w:id="0" w:name="_GoBack"/>
+      <w:bookmarkEnd w:id="0"/>
+    </w:p>
+    <w:p>
+      <w:pPr>
+        <w:spacing w:after="0" w:line="276" w:lineRule="auto"/>
+        <w:rPr>
+          <w:color w:val="FF0000"/>
+          <w:lang w:val="es-ES"/>
+        </w:rPr>
+      </w:pPr>
+      <w:r>
+        <w:rPr>
+          <w:noProof/>
+          <w:lang w:val="en-US"/>
+        </w:rPr>
+        <w:lastRenderedPageBreak/>
         <w:drawing>
           <wp:anchor distT="0" distB="0" distL="114300" distR="114300" simplePos="0" relativeHeight="251658240" behindDoc="0" locked="0" layoutInCell="1" allowOverlap="1">
             <wp:simplePos x="0" y="0"/>
             <wp:positionH relativeFrom="column">
-              <wp:posOffset>-317500</wp:posOffset>
+              <wp:posOffset>-297815</wp:posOffset>
             </wp:positionH>
             <wp:positionV relativeFrom="paragraph">
-              <wp:posOffset>-478155</wp:posOffset>
+              <wp:posOffset>-831215</wp:posOffset>
             </wp:positionV>
             <wp:extent cx="6323965" cy="4538471"/>
             <wp:effectExtent l="0" t="0" r="635" b="0"/>
@@ -9037,11 +9147,30 @@
           </wp:anchor>
         </w:drawing>
       </w:r>
+      <w:r>
+        <w:rPr>
+          <w:lang w:val="es-ES"/>
+        </w:rPr>
+        <w:br/>
+      </w:r>
+      <w:r>
+        <w:rPr>
+          <w:lang w:val="es-ES"/>
+        </w:rPr>
+        <w:br/>
+      </w:r>
+      <w:r>
+        <w:rPr>
+          <w:lang w:val="es-ES"/>
+        </w:rPr>
+        <w:br/>
+      </w:r>
     </w:p>
     <w:p>
       <w:pPr>
         <w:spacing w:after="0" w:line="276" w:lineRule="auto"/>
         <w:rPr>
+          <w:color w:val="FF0000"/>
           <w:lang w:val="es-ES"/>
         </w:rPr>
       </w:pPr>
@@ -9050,6 +9179,7 @@
       <w:pPr>
         <w:spacing w:after="0" w:line="276" w:lineRule="auto"/>
         <w:rPr>
+          <w:color w:val="FF0000"/>
           <w:lang w:val="es-ES"/>
         </w:rPr>
       </w:pPr>
@@ -9061,6 +9191,12 @@
           <w:lang w:val="es-ES"/>
         </w:rPr>
       </w:pPr>
+      <w:r>
+        <w:rPr>
+          <w:lang w:val="es-ES"/>
+        </w:rPr>
+        <w:br/>
+      </w:r>
     </w:p>
     <w:p>
       <w:pPr>
@@ -9133,46 +9269,19 @@
           <w:lang w:val="es-ES"/>
         </w:rPr>
       </w:pPr>
-      <w:r>
-        <w:rPr>
-          <w:lang w:val="es-ES"/>
-        </w:rPr>
-        <w:br/>
-      </w:r>
     </w:p>
     <w:p>
       <w:pPr>
         <w:spacing w:after="0" w:line="276" w:lineRule="auto"/>
         <w:rPr>
-          <w:color w:val="FF0000"/>
-          <w:lang w:val="es-ES"/>
-        </w:rPr>
-      </w:pPr>
-      <w:r>
-        <w:rPr>
-          <w:lang w:val="es-ES"/>
-        </w:rPr>
-        <w:lastRenderedPageBreak/>
-        <w:br/>
-      </w:r>
-      <w:r>
-        <w:rPr>
-          <w:lang w:val="es-ES"/>
-        </w:rPr>
-        <w:br/>
-      </w:r>
-      <w:r>
-        <w:rPr>
-          <w:lang w:val="es-ES"/>
-        </w:rPr>
-        <w:br/>
-      </w:r>
+          <w:lang w:val="es-ES"/>
+        </w:rPr>
+      </w:pPr>
     </w:p>
     <w:p>
       <w:pPr>
         <w:spacing w:after="0" w:line="276" w:lineRule="auto"/>
         <w:rPr>
-          <w:color w:val="FF0000"/>
           <w:lang w:val="es-ES"/>
         </w:rPr>
       </w:pPr>
@@ -9181,24 +9290,9 @@
       <w:pPr>
         <w:spacing w:after="0" w:line="276" w:lineRule="auto"/>
         <w:rPr>
-          <w:color w:val="FF0000"/>
-          <w:lang w:val="es-ES"/>
-        </w:rPr>
-      </w:pPr>
-    </w:p>
-    <w:p>
-      <w:pPr>
-        <w:spacing w:after="0" w:line="276" w:lineRule="auto"/>
-        <w:rPr>
-          <w:lang w:val="es-ES"/>
-        </w:rPr>
-      </w:pPr>
-      <w:r>
-        <w:rPr>
-          <w:lang w:val="es-ES"/>
-        </w:rPr>
-        <w:br/>
-      </w:r>
+          <w:lang w:val="es-ES"/>
+        </w:rPr>
+      </w:pPr>
       <w:r>
         <w:rPr>
           <w:lang w:val="es-ES"/>
@@ -9407,7 +9501,7 @@
           <w:rFonts w:ascii="Consolas" w:hAnsi="Consolas" w:cs="Consolas"/>
           <w:sz w:val="20"/>
           <w:szCs w:val="20"/>
-          <w:lang w:val="en-US"/>
+          <w:lang w:val="es-ES"/>
         </w:rPr>
       </w:pPr>
       <w:r>
@@ -9437,7 +9531,7 @@
           <w:color w:val="000000"/>
           <w:sz w:val="20"/>
           <w:szCs w:val="20"/>
-          <w:lang w:val="en-US"/>
+          <w:lang w:val="es-ES"/>
         </w:rPr>
         <w:t>PruebaPadre</w:t>
       </w:r>
@@ -9448,29 +9542,27 @@
           <w:color w:val="000000"/>
           <w:sz w:val="20"/>
           <w:szCs w:val="20"/>
-          <w:lang w:val="en-US"/>
+          <w:lang w:val="es-ES"/>
         </w:rPr>
         <w:t xml:space="preserve"> </w:t>
       </w:r>
-      <w:proofErr w:type="spellStart"/>
       <w:r>
         <w:rPr>
           <w:rFonts w:ascii="Consolas" w:hAnsi="Consolas" w:cs="Consolas"/>
           <w:color w:val="6A3E3E"/>
           <w:sz w:val="20"/>
           <w:szCs w:val="20"/>
-          <w:lang w:val="en-US"/>
+          <w:lang w:val="es-ES"/>
         </w:rPr>
         <w:t>prueba</w:t>
       </w:r>
-      <w:proofErr w:type="spellEnd"/>
-      <w:r>
-        <w:rPr>
-          <w:rFonts w:ascii="Consolas" w:hAnsi="Consolas" w:cs="Consolas"/>
-          <w:color w:val="000000"/>
-          <w:sz w:val="20"/>
-          <w:szCs w:val="20"/>
-          <w:lang w:val="en-US"/>
+      <w:r>
+        <w:rPr>
+          <w:rFonts w:ascii="Consolas" w:hAnsi="Consolas" w:cs="Consolas"/>
+          <w:color w:val="000000"/>
+          <w:sz w:val="20"/>
+          <w:szCs w:val="20"/>
+          <w:lang w:val="es-ES"/>
         </w:rPr>
         <w:t xml:space="preserve"> = </w:t>
       </w:r>
@@ -9482,7 +9574,7 @@
           <w:color w:val="7F0055"/>
           <w:sz w:val="20"/>
           <w:szCs w:val="20"/>
-          <w:lang w:val="en-US"/>
+          <w:lang w:val="es-ES"/>
         </w:rPr>
         <w:t>new</w:t>
       </w:r>
@@ -9492,7 +9584,7 @@
           <w:color w:val="000000"/>
           <w:sz w:val="20"/>
           <w:szCs w:val="20"/>
-          <w:lang w:val="en-US"/>
+          <w:lang w:val="es-ES"/>
         </w:rPr>
         <w:t xml:space="preserve"> </w:t>
       </w:r>
@@ -9504,7 +9596,7 @@
           <w:color w:val="000000"/>
           <w:sz w:val="20"/>
           <w:szCs w:val="20"/>
-          <w:lang w:val="en-US"/>
+          <w:lang w:val="es-ES"/>
         </w:rPr>
         <w:t>PruebaHijo</w:t>
       </w:r>
@@ -9515,7 +9607,7 @@
           <w:color w:val="000000"/>
           <w:sz w:val="20"/>
           <w:szCs w:val="20"/>
-          <w:lang w:val="en-US"/>
+          <w:lang w:val="es-ES"/>
         </w:rPr>
         <w:t>(</w:t>
       </w:r>
@@ -9526,7 +9618,7 @@
           <w:color w:val="000000"/>
           <w:sz w:val="20"/>
           <w:szCs w:val="20"/>
-          <w:lang w:val="en-US"/>
+          <w:lang w:val="es-ES"/>
         </w:rPr>
         <w:t>);</w:t>
       </w:r>
@@ -9541,16 +9633,16 @@
           <w:rFonts w:ascii="Consolas" w:hAnsi="Consolas" w:cs="Consolas"/>
           <w:sz w:val="20"/>
           <w:szCs w:val="20"/>
-          <w:lang w:val="en-US"/>
-        </w:rPr>
-      </w:pPr>
-      <w:r>
-        <w:rPr>
-          <w:rFonts w:ascii="Consolas" w:hAnsi="Consolas" w:cs="Consolas"/>
-          <w:color w:val="000000"/>
-          <w:sz w:val="20"/>
-          <w:szCs w:val="20"/>
-          <w:lang w:val="en-US"/>
+          <w:lang w:val="es-ES"/>
+        </w:rPr>
+      </w:pPr>
+      <w:r>
+        <w:rPr>
+          <w:rFonts w:ascii="Consolas" w:hAnsi="Consolas" w:cs="Consolas"/>
+          <w:color w:val="000000"/>
+          <w:sz w:val="20"/>
+          <w:szCs w:val="20"/>
+          <w:lang w:val="es-ES"/>
         </w:rPr>
         <w:tab/>
       </w:r>
@@ -9560,7 +9652,7 @@
           <w:color w:val="000000"/>
           <w:sz w:val="20"/>
           <w:szCs w:val="20"/>
-          <w:lang w:val="en-US"/>
+          <w:lang w:val="es-ES"/>
         </w:rPr>
         <w:tab/>
       </w:r>
@@ -9572,7 +9664,7 @@
           <w:color w:val="6A3E3E"/>
           <w:sz w:val="20"/>
           <w:szCs w:val="20"/>
-          <w:lang w:val="en-US"/>
+          <w:lang w:val="es-ES"/>
         </w:rPr>
         <w:t>prueba</w:t>
       </w:r>
@@ -9582,21 +9674,11 @@
           <w:color w:val="000000"/>
           <w:sz w:val="20"/>
           <w:szCs w:val="20"/>
-          <w:lang w:val="en-US"/>
+          <w:lang w:val="es-ES"/>
         </w:rPr>
         <w:t>.saySomething</w:t>
       </w:r>
       <w:proofErr w:type="spellEnd"/>
-      <w:r>
-        <w:rPr>
-          <w:rFonts w:ascii="Consolas" w:hAnsi="Consolas" w:cs="Consolas"/>
-          <w:color w:val="000000"/>
-          <w:sz w:val="20"/>
-          <w:szCs w:val="20"/>
-          <w:lang w:val="en-US"/>
-        </w:rPr>
-        <w:t>(</w:t>
-      </w:r>
       <w:proofErr w:type="gramEnd"/>
       <w:r>
         <w:rPr>
@@ -9604,9 +9686,9 @@
           <w:color w:val="000000"/>
           <w:sz w:val="20"/>
           <w:szCs w:val="20"/>
-          <w:lang w:val="en-US"/>
-        </w:rPr>
-        <w:t>);</w:t>
+          <w:lang w:val="es-ES"/>
+        </w:rPr>
+        <w:t>();</w:t>
       </w:r>
     </w:p>
     <w:p>
@@ -9628,9 +9710,18 @@
           <w:color w:val="000000"/>
           <w:sz w:val="20"/>
           <w:szCs w:val="20"/>
-          <w:lang w:val="en-US"/>
+          <w:lang w:val="es-ES"/>
         </w:rPr>
         <w:tab/>
+      </w:r>
+      <w:r>
+        <w:rPr>
+          <w:rFonts w:ascii="Consolas" w:hAnsi="Consolas" w:cs="Consolas"/>
+          <w:color w:val="000000"/>
+          <w:sz w:val="20"/>
+          <w:szCs w:val="20"/>
+          <w:lang w:val="en-US"/>
+        </w:rPr>
         <w:t>}</w:t>
       </w:r>
     </w:p>
@@ -9806,17 +9897,18 @@
           <w:rFonts w:ascii="Consolas" w:hAnsi="Consolas" w:cs="Consolas"/>
           <w:sz w:val="20"/>
           <w:szCs w:val="20"/>
-          <w:lang w:val="es-ES"/>
-        </w:rPr>
-      </w:pPr>
-      <w:proofErr w:type="spellStart"/>
-      <w:r>
-        <w:rPr>
-          <w:rFonts w:ascii="Consolas" w:hAnsi="Consolas" w:cs="Consolas"/>
-          <w:color w:val="000000"/>
-          <w:sz w:val="20"/>
-          <w:szCs w:val="20"/>
-          <w:lang w:val="es-ES"/>
+          <w:lang w:val="en-US"/>
+        </w:rPr>
+      </w:pPr>
+      <w:proofErr w:type="spellStart"/>
+      <w:proofErr w:type="gramStart"/>
+      <w:r>
+        <w:rPr>
+          <w:rFonts w:ascii="Consolas" w:hAnsi="Consolas" w:cs="Consolas"/>
+          <w:color w:val="000000"/>
+          <w:sz w:val="20"/>
+          <w:szCs w:val="20"/>
+          <w:lang w:val="en-US"/>
         </w:rPr>
         <w:t>System.</w:t>
       </w:r>
@@ -9830,7 +9922,7 @@
           <w:color w:val="0000C0"/>
           <w:sz w:val="20"/>
           <w:szCs w:val="20"/>
-          <w:lang w:val="es-ES"/>
+          <w:lang w:val="en-US"/>
         </w:rPr>
         <w:t>out</w:t>
       </w:r>
@@ -9840,7 +9932,7 @@
           <w:color w:val="000000"/>
           <w:sz w:val="20"/>
           <w:szCs w:val="20"/>
-          <w:lang w:val="es-ES"/>
+          <w:lang w:val="en-US"/>
         </w:rPr>
         <w:t>.println</w:t>
       </w:r>
@@ -9851,17 +9943,18 @@
           <w:color w:val="000000"/>
           <w:sz w:val="20"/>
           <w:szCs w:val="20"/>
-          <w:lang w:val="es-ES"/>
+          <w:lang w:val="en-US"/>
         </w:rPr>
         <w:t>(</w:t>
       </w:r>
+      <w:proofErr w:type="gramEnd"/>
       <w:r>
         <w:rPr>
           <w:rFonts w:ascii="Consolas" w:hAnsi="Consolas" w:cs="Consolas"/>
           <w:color w:val="2A00FF"/>
           <w:sz w:val="20"/>
           <w:szCs w:val="20"/>
-          <w:lang w:val="es-ES"/>
+          <w:lang w:val="en-US"/>
         </w:rPr>
         <w:t>"</w:t>
       </w:r>
@@ -9872,7 +9965,7 @@
           <w:color w:val="2A00FF"/>
           <w:sz w:val="20"/>
           <w:szCs w:val="20"/>
-          <w:lang w:val="es-ES"/>
+          <w:lang w:val="en-US"/>
         </w:rPr>
         <w:t>Somethng</w:t>
       </w:r>
@@ -9883,7 +9976,7 @@
           <w:color w:val="2A00FF"/>
           <w:sz w:val="20"/>
           <w:szCs w:val="20"/>
-          <w:lang w:val="es-ES"/>
+          <w:lang w:val="en-US"/>
         </w:rPr>
         <w:t>"</w:t>
       </w:r>
@@ -9893,7 +9986,7 @@
           <w:color w:val="000000"/>
           <w:sz w:val="20"/>
           <w:szCs w:val="20"/>
-          <w:lang w:val="es-ES"/>
+          <w:lang w:val="en-US"/>
         </w:rPr>
         <w:t>);</w:t>
       </w:r>
@@ -9903,7 +9996,7 @@
           <w:color w:val="000000"/>
           <w:sz w:val="20"/>
           <w:szCs w:val="20"/>
-          <w:lang w:val="es-ES"/>
+          <w:lang w:val="en-US"/>
         </w:rPr>
         <w:tab/>
       </w:r>
@@ -9913,17 +10006,17 @@
           <w:color w:val="000000"/>
           <w:sz w:val="20"/>
           <w:szCs w:val="20"/>
-          <w:lang w:val="es-ES"/>
-        </w:rPr>
-        <w:br/>
-      </w:r>
-      <w:r>
-        <w:rPr>
-          <w:rFonts w:ascii="Consolas" w:hAnsi="Consolas" w:cs="Consolas"/>
-          <w:color w:val="000000"/>
-          <w:sz w:val="20"/>
-          <w:szCs w:val="20"/>
-          <w:lang w:val="es-ES"/>
+          <w:lang w:val="en-US"/>
+        </w:rPr>
+        <w:br/>
+      </w:r>
+      <w:r>
+        <w:rPr>
+          <w:rFonts w:ascii="Consolas" w:hAnsi="Consolas" w:cs="Consolas"/>
+          <w:color w:val="000000"/>
+          <w:sz w:val="20"/>
+          <w:szCs w:val="20"/>
+          <w:lang w:val="en-US"/>
         </w:rPr>
         <w:t>}</w:t>
       </w:r>
@@ -9940,6 +10033,11 @@
           <w:lang w:val="es-ES"/>
         </w:rPr>
         <w:br/>
+      </w:r>
+      <w:r>
+        <w:rPr>
+          <w:lang w:val="es-ES"/>
+        </w:rPr>
         <w:t xml:space="preserve">Originalmente, se llama al método </w:t>
       </w:r>
       <w:proofErr w:type="spellStart"/>
@@ -10021,6 +10119,7 @@
         <w:rPr>
           <w:lang w:val="es-ES"/>
         </w:rPr>
+        <w:lastRenderedPageBreak/>
         <w:t>4.</w:t>
       </w:r>
       <w:r>
@@ -10116,7 +10215,6 @@
         <w:rPr>
           <w:lang w:val="es-ES"/>
         </w:rPr>
-        <w:lastRenderedPageBreak/>
         <w:br/>
       </w:r>
       <w:r>

</xml_diff>